<commit_message>
Updating Data Processing Record
</commit_message>
<xml_diff>
--- a/Documentation/Data Processing Record.docx
+++ b/Documentation/Data Processing Record.docx
@@ -11,10 +11,18 @@
     <w:p/>
     <w:p>
       <w:r>
+        <w:rPr>
+          <w:lang w:val="en-US"/>
+        </w:rPr>
         <w:t>Name: TY</w:t>
       </w:r>
       <w:r>
         <w:tab/>
+      </w:r>
+      <w:r>
+        <w:rPr>
+          <w:lang w:val="en-US"/>
+        </w:rPr>
         <w:t>Commit Date: 10/15/2026</w:t>
       </w:r>
     </w:p>
@@ -39,20 +47,18 @@
     </w:p>
     <w:p>
       <w:r>
+        <w:rPr>
+          <w:lang w:val="en-US"/>
+        </w:rPr>
         <w:t xml:space="preserve">Sorted by date and deleted all rows from 2023-01-01 to 2025-09-30. </w:t>
       </w:r>
     </w:p>
     <w:p>
       <w:r>
-        <w:t xml:space="preserve">Added column INCIDENT_ID with values 1,2,3… </w:t>
-      </w:r>
-      <w:proofErr w:type="spellStart"/>
-      <w:r>
-        <w:t>etc</w:t>
-      </w:r>
-      <w:proofErr w:type="spellEnd"/>
-      <w:r>
-        <w:t xml:space="preserve"> to serve as primary key for a future SQL table. </w:t>
+        <w:rPr>
+          <w:lang w:val="en-US"/>
+        </w:rPr>
+        <w:t xml:space="preserve">Added column INCIDENT_ID with values 1,2,3… etc to serve as primary key for a future SQL table. </w:t>
       </w:r>
     </w:p>
     <w:p>
@@ -68,10 +74,18 @@
         </w:numPr>
       </w:pPr>
       <w:r>
+        <w:rPr>
+          <w:lang w:val="en-US"/>
+        </w:rPr>
         <w:t>OFFENSE_CODE_GROUP:</w:t>
       </w:r>
       <w:r>
         <w:tab/>
+      </w:r>
+      <w:r>
+        <w:rPr>
+          <w:lang w:val="en-US"/>
+        </w:rPr>
         <w:t>All values were NULL</w:t>
       </w:r>
     </w:p>
@@ -83,6 +97,9 @@
         </w:numPr>
       </w:pPr>
       <w:r>
+        <w:rPr>
+          <w:lang w:val="en-US"/>
+        </w:rPr>
         <w:t>DISTRICT:</w:t>
       </w:r>
       <w:r>
@@ -93,6 +110,11 @@
       </w:r>
       <w:r>
         <w:tab/>
+      </w:r>
+      <w:r>
+        <w:rPr>
+          <w:lang w:val="en-US"/>
+        </w:rPr>
         <w:t>Values not meaningful; we will use Lat/Long for location</w:t>
       </w:r>
     </w:p>
@@ -104,10 +126,16 @@
         </w:numPr>
       </w:pPr>
       <w:r>
+        <w:rPr>
+          <w:lang w:val="en-US"/>
+        </w:rPr>
         <w:t>REPORTING_AREA</w:t>
       </w:r>
       <w:proofErr w:type="gramStart"/>
       <w:r>
+        <w:rPr>
+          <w:lang w:val="en-US"/>
+        </w:rPr>
         <w:t>:</w:t>
       </w:r>
       <w:r>
@@ -115,10 +143,18 @@
       </w:r>
       <w:r>
         <w:tab/>
+      </w:r>
+      <w:r>
+        <w:rPr>
+          <w:lang w:val="en-US"/>
+        </w:rPr>
         <w:t>Values</w:t>
       </w:r>
       <w:proofErr w:type="gramEnd"/>
       <w:r>
+        <w:rPr>
+          <w:lang w:val="en-US"/>
+        </w:rPr>
         <w:t xml:space="preserve"> not meaningful; we will use Lat/Long for location</w:t>
       </w:r>
     </w:p>
@@ -130,6 +166,9 @@
         </w:numPr>
       </w:pPr>
       <w:r>
+        <w:rPr>
+          <w:lang w:val="en-US"/>
+        </w:rPr>
         <w:t>SHOOTING:</w:t>
       </w:r>
       <w:r>
@@ -140,15 +179,12 @@
       </w:r>
       <w:r>
         <w:tab/>
-        <w:t xml:space="preserve">Offense descriptions (murder, weapon use, </w:t>
-      </w:r>
-      <w:proofErr w:type="spellStart"/>
-      <w:r>
-        <w:t>etc</w:t>
-      </w:r>
-      <w:proofErr w:type="spellEnd"/>
-      <w:r>
-        <w:t>) provide the same information</w:t>
+      </w:r>
+      <w:r>
+        <w:rPr>
+          <w:lang w:val="en-US"/>
+        </w:rPr>
+        <w:t>Offense descriptions (murder, weapon use, etc) provide the same information</w:t>
       </w:r>
     </w:p>
     <w:p>
@@ -159,6 +195,9 @@
         </w:numPr>
       </w:pPr>
       <w:r>
+        <w:rPr>
+          <w:lang w:val="en-US"/>
+        </w:rPr>
         <w:t>UCR_PART:</w:t>
       </w:r>
       <w:r>
@@ -169,6 +208,11 @@
       </w:r>
       <w:r>
         <w:tab/>
+      </w:r>
+      <w:r>
+        <w:rPr>
+          <w:lang w:val="en-US"/>
+        </w:rPr>
         <w:t>Values not meaningful; we will use Lat/Long for location</w:t>
       </w:r>
     </w:p>
@@ -202,6 +246,9 @@
         </w:numPr>
       </w:pPr>
       <w:r>
+        <w:rPr>
+          <w:lang w:val="en-US"/>
+        </w:rPr>
         <w:t>Location:</w:t>
       </w:r>
       <w:r>
@@ -212,6 +259,11 @@
       </w:r>
       <w:r>
         <w:tab/>
+      </w:r>
+      <w:r>
+        <w:rPr>
+          <w:lang w:val="en-US"/>
+        </w:rPr>
         <w:t xml:space="preserve">This information will be assembled from Lat/Long columns </w:t>
       </w:r>
     </w:p>
@@ -220,19 +272,33 @@
     <w:p/>
     <w:p>
       <w:r>
+        <w:rPr>
+          <w:lang w:val="en-US"/>
+        </w:rPr>
         <w:t xml:space="preserve">Name: </w:t>
       </w:r>
       <w:r>
         <w:tab/>
       </w:r>
       <w:r>
+        <w:rPr>
+          <w:lang w:val="en-US"/>
+        </w:rPr>
         <w:t>TY</w:t>
       </w:r>
       <w:r>
         <w:tab/>
+      </w:r>
+      <w:r>
+        <w:rPr>
+          <w:lang w:val="en-US"/>
+        </w:rPr>
         <w:t>Commit Date:</w:t>
       </w:r>
       <w:r>
+        <w:rPr>
+          <w:lang w:val="en-US"/>
+        </w:rPr>
         <w:t xml:space="preserve"> 10/20/2026</w:t>
       </w:r>
     </w:p>
@@ -243,68 +309,138 @@
     </w:p>
     <w:p>
       <w:r>
-        <w:t xml:space="preserve">Removed all rows pertaining to “crimes” deemed not-applicable or already-covered. Examples include Truancy and Fare Evasion, which would lead to schools and public transport locations being weighted </w:t>
-      </w:r>
-      <w:r>
+        <w:rPr>
+          <w:lang w:val="en-US"/>
+        </w:rPr>
+        <w:t xml:space="preserve">Removed all rows pertaining to “crimes” deemed not-applicable or already-covered. Examples include Truancy and Fare Evasion, which would lead to schools and public transport locations being </w:t>
+      </w:r>
+      <w:proofErr w:type="gramStart"/>
+      <w:r>
+        <w:rPr>
+          <w:lang w:val="en-US"/>
+        </w:rPr>
+        <w:t>weighted</w:t>
+      </w:r>
+      <w:proofErr w:type="gramEnd"/>
+      <w:r>
+        <w:rPr>
+          <w:lang w:val="en-US"/>
+        </w:rPr>
+        <w:t xml:space="preserve"> </w:t>
+      </w:r>
+      <w:r>
+        <w:rPr>
+          <w:lang w:val="en-US"/>
+        </w:rPr>
         <w:t>as more dangerous. Harbor Crimes and Aviation Crimes were removed for the same reason. Investigate Property, Death Investigation, and Sick Assist are examples of non-criminal r</w:t>
       </w:r>
       <w:r>
+        <w:rPr>
+          <w:lang w:val="en-US"/>
+        </w:rPr>
         <w:t>ows</w:t>
       </w:r>
       <w:r>
+        <w:rPr>
+          <w:lang w:val="en-US"/>
+        </w:rPr>
         <w:t xml:space="preserve"> removed. </w:t>
       </w:r>
     </w:p>
     <w:p/>
     <w:p>
       <w:r>
+        <w:rPr>
+          <w:lang w:val="en-US"/>
+        </w:rPr>
         <w:t>Split remaining crimes into violent and non-violent files to allow us smaller sets to work with and potentially layer in the final visualization.</w:t>
       </w:r>
       <w:r>
         <w:br/>
-        <w:t>Organized files into folders</w:t>
-      </w:r>
-      <w:r>
-        <w:t xml:space="preserve"> Data and Documentation.</w:t>
+      </w:r>
+      <w:r>
+        <w:rPr>
+          <w:lang w:val="en-US"/>
+        </w:rPr>
+        <w:t>Organized files into folders Data and Documentation.</w:t>
       </w:r>
       <w:r>
         <w:br/>
-        <w:t xml:space="preserve">Assigned </w:t>
-      </w:r>
-      <w:proofErr w:type="spellStart"/>
-      <w:r>
-        <w:t>NV_Incident_ID</w:t>
-      </w:r>
-      <w:proofErr w:type="spellEnd"/>
-      <w:r>
-        <w:t xml:space="preserve"> or </w:t>
-      </w:r>
-      <w:proofErr w:type="spellStart"/>
-      <w:r>
-        <w:t>V_Incident_IDs</w:t>
-      </w:r>
-      <w:proofErr w:type="spellEnd"/>
-      <w:r>
-        <w:t xml:space="preserve"> to all crime entries</w:t>
-      </w:r>
-      <w:r>
-        <w:t xml:space="preserve"> to serve as primary key</w:t>
+      </w:r>
+      <w:r>
+        <w:rPr>
+          <w:lang w:val="en-US"/>
+        </w:rPr>
+        <w:t>Assigned NV_Incident_ID or V_Incident_IDs to all crime entries to serve as primary key</w:t>
       </w:r>
       <w:r>
         <w:br/>
-        <w:t xml:space="preserve">Deleted </w:t>
-      </w:r>
-      <w:proofErr w:type="spellStart"/>
-      <w:r>
-        <w:t>Incident_Code</w:t>
-      </w:r>
-      <w:proofErr w:type="spellEnd"/>
-      <w:r>
-        <w:t xml:space="preserve"> columns</w:t>
-      </w:r>
-      <w:r>
-        <w:t xml:space="preserve"> because this information is accounted for with the crime description/type</w:t>
-      </w:r>
+      </w:r>
+      <w:r>
+        <w:rPr>
+          <w:lang w:val="en-US"/>
+        </w:rPr>
+        <w:t>Deleted Incident_Code columns because this information is accounted for with the crime description/type</w:t>
+      </w:r>
+    </w:p>
+    <w:p>
+      <w:pPr>
+        <w:rPr>
+          <w:lang w:val="en-US"/>
+        </w:rPr>
+      </w:pPr>
+    </w:p>
+    <w:p>
+      <w:r>
+        <w:rPr>
+          <w:lang w:val="en-US"/>
+        </w:rPr>
+        <w:t>Name: ES</w:t>
+      </w:r>
+      <w:r>
+        <w:tab/>
+      </w:r>
+      <w:r>
+        <w:rPr>
+          <w:lang w:val="en-US"/>
+        </w:rPr>
+        <w:t>Commit Date: 10/26/2026</w:t>
+      </w:r>
+    </w:p>
+    <w:p>
+      <w:r>
+        <w:t>Description:</w:t>
+      </w:r>
+    </w:p>
+    <w:p>
+      <w:r>
+        <w:rPr>
+          <w:lang w:val="en-US"/>
+        </w:rPr>
+        <w:t xml:space="preserve">Updated the Nonviolent Crimes data to exclude the crime type </w:t>
+      </w:r>
+      <w:r>
+        <w:rPr>
+          <w:color w:val="1F2328"/>
+          <w:lang w:val="en-US"/>
+        </w:rPr>
+        <w:t>DRUGS - POSSESSION/ SALE/ MANUFACTURING/ USE because it has no direct impact on tourist personal safety</w:t>
+      </w:r>
+      <w:r>
+        <w:rPr>
+          <w:color w:val="1F2328"/>
+          <w:lang w:val="en-US"/>
+        </w:rPr>
+        <w:t>.</w:t>
+      </w:r>
+    </w:p>
+    <w:p>
+      <w:pPr>
+        <w:rPr>
+          <w:color w:val="1F2328"/>
+          <w:lang w:val="en-US"/>
+        </w:rPr>
+      </w:pPr>
     </w:p>
     <w:p/>
     <w:p/>
@@ -955,6 +1091,7 @@
   <w:style w:type="character" w:default="1" w:styleId="DefaultParagraphFont">
     <w:name w:val="Default Paragraph Font"/>
     <w:uiPriority w:val="1"/>
+    <w:semiHidden/>
     <w:unhideWhenUsed/>
   </w:style>
   <w:style w:type="table" w:default="1" w:styleId="TableNormal">

</xml_diff>